<commit_message>
Expand Demo B with full DTP step-by-step; add example messages to DQ explainer
README: Demo B now matches Demo A format — navigation steps, exact values to enter,
  biological rationale for why DTP3>DTP1 is impossible, threshold calculation shown,
  exact WhatsApp messages at each turn, DHIS2 verification step

dq_logic_explained.md: added example alert message for DTP check (DTP1=60, DTP3=90),
  full option 2 conversation flow (3 turns to resolution), resolution confirmation text

generate_ux_doc.py / AHEAD_AI_UX_Workflow.docx: Demo B rewritten with same detail
  level as Demo A — 7 steps, exact SMS text using current message format, narration
  cues for presenter, expected final DHIS2 state

Co-Authored-By: Claude Sonnet 4.6 <noreply@anthropic.com>
</commit_message>
<xml_diff>
--- a/docs/AHEAD_AI_UX_Workflow.docx
+++ b/docs/AHEAD_AI_UX_Workflow.docx
@@ -6657,7 +6657,7 @@
         <w:rPr>
           <w:sz w:val="21"/>
         </w:rPr>
-        <w:t>What this shows: Almaz accidentally swaps her Penta1 and Penta3 figures. The agent fires — Penta3 &gt; Penta1 by 50%, above the 30% relative threshold for monthly facility data. Same form, same login.</w:t>
+        <w:t>What this shows: Almaz accidentally enters a higher value for Penta3 (DTP3) than for Penta1 (DTP1). This is biologically impossible — more children cannot have completed the vaccine series than started it. The agent detects the gap (50% relative difference, above the 30% AHEAD threshold), sends an alert with the same response options as the AHEAD Excel dropdown, and automatically corrects the value in DHIS2 after confirmation.</w:t>
       </w:r>
     </w:p>
     <w:p/>
@@ -6666,7 +6666,7 @@
         <w:rPr>
           <w:sz w:val="21"/>
         </w:rPr>
-        <w:t>Step 1 — Edit the same June 2026 form</w:t>
+        <w:t>Step 1 — Navigate to the same June 2026 form</w:t>
       </w:r>
     </w:p>
     <w:p>
@@ -6675,7 +6675,7 @@
         <w:ind w:left="360"/>
       </w:pPr>
       <w:r>
-        <w:t>Still logged in as eth_facility_01. Navigate back to Addi Arekay HC / June 2026.</w:t>
+        <w:t>Still logged in as eth_facility_01.</w:t>
       </w:r>
     </w:p>
     <w:p>
@@ -6684,34 +6684,7 @@
         <w:ind w:left="360"/>
       </w:pPr>
       <w:r>
-        <w:t>BCG is now 97 (corrected in Demo A). The Penta values currently read: Penta1 under-1: 88, Penta3 under-1: 72.</w:t>
-      </w:r>
-    </w:p>
-    <w:p>
-      <w:pPr>
-        <w:pStyle w:val="ListBullet"/>
-        <w:ind w:left="360"/>
-      </w:pPr>
-      <w:r>
-        <w:t>Update: Penta1 under-1 = 60, Penta3 under-1 = 90</w:t>
-      </w:r>
-    </w:p>
-    <w:p>
-      <w:pPr>
-        <w:pStyle w:val="ListBullet"/>
-        <w:ind w:left="360"/>
-      </w:pPr>
-      <w:r>
-        <w:t>Narrate: "Almaz has swapped the Penta1 and Penta3 figures — maybe copied from the wrong row on her tally sheet."</w:t>
-      </w:r>
-    </w:p>
-    <w:p>
-      <w:pPr>
-        <w:pStyle w:val="ListBullet"/>
-        <w:ind w:left="360"/>
-      </w:pPr>
-      <w:r>
-        <w:t>Click Save</w:t>
+        <w:t>Data Entry → Addi Arekay Health Center → EPI - Routine vaccine delivery → June 2026</w:t>
       </w:r>
     </w:p>
     <w:p/>
@@ -6720,7 +6693,7 @@
         <w:rPr>
           <w:sz w:val="21"/>
         </w:rPr>
-        <w:t>Step 2 — Agent detects the DTP violation (~30 seconds)</w:t>
+        <w:t>Step 2 — Enter the inconsistent values</w:t>
       </w:r>
     </w:p>
     <w:p>
@@ -6729,7 +6702,7 @@
         <w:ind w:left="360"/>
       </w:pPr>
       <w:r>
-        <w:t>Wait or POST http://localhost:5001/api/scan</w:t>
+        <w:t>In the Vaccinations - children table:</w:t>
       </w:r>
     </w:p>
     <w:p>
@@ -6738,7 +6711,7 @@
         <w:ind w:left="360"/>
       </w:pPr>
       <w:r>
-        <w:t>Agent runs DTP check. Relative difference: (90-60)/60 = 50% — above the 30% threshold. Absolute diff = 30 — below 100 but relative threshold fires.</w:t>
+        <w:t>DPT-HepB-HIB 1, &lt; 1 year: type 60, press Tab</w:t>
       </w:r>
     </w:p>
     <w:p>
@@ -6747,7 +6720,34 @@
         <w:ind w:left="360"/>
       </w:pPr>
       <w:r>
-        <w:t>New issue created and visible in http://localhost:5001/issues as NOTIFIED</w:t>
+        <w:t>DPT-HepB-HIB 3, &lt; 1 year: type 90, press Tab</w:t>
+      </w:r>
+    </w:p>
+    <w:p>
+      <w:pPr>
+        <w:pStyle w:val="ListBullet"/>
+        <w:ind w:left="360"/>
+      </w:pPr>
+      <w:r>
+        <w:t>Both fields turn green (saved).</w:t>
+      </w:r>
+    </w:p>
+    <w:p>
+      <w:pPr>
+        <w:pStyle w:val="ListBullet"/>
+        <w:ind w:left="360"/>
+      </w:pPr>
+      <w:r>
+        <w:t>Narrate: "Almaz copied the figures from her paper tally sheet but swapped the rows. DTP3 = 90 &gt; DTP1 = 60 is epidemiologically impossible — dropout only flows one direction."</w:t>
+      </w:r>
+    </w:p>
+    <w:p>
+      <w:pPr>
+        <w:pStyle w:val="ListBullet"/>
+        <w:ind w:left="360"/>
+      </w:pPr>
+      <w:r>
+        <w:t>Threshold: |(90-60)/60| = 50% relative gap, above the 30% AHEAD facility-monthly threshold.</w:t>
       </w:r>
     </w:p>
     <w:p/>
@@ -6756,48 +6756,16 @@
         <w:rPr>
           <w:sz w:val="21"/>
         </w:rPr>
-        <w:t>Step 3 — SMS arrives</w:t>
+        <w:t>Step 3 — Watch the issue log (~30 seconds)</w:t>
       </w:r>
     </w:p>
     <w:p>
       <w:pPr>
-        <w:ind w:left="576"/>
-        <w:shd w:val="clear" w:color="auto" w:fill="F2F2F2"/>
-      </w:pPr>
-      <w:r>
-        <w:rPr>
-          <w:rFonts w:ascii="Courier New" w:hAnsi="Courier New"/>
-          <w:color w:val="333333"/>
-          <w:sz w:val="17"/>
-        </w:rPr>
-        <w:t>AHEAD DQ Alert [DQ-XXXX]</w:t>
-        <w:br/>
-        <w:t>Addi Arekay Health Center — Jun 2026</w:t>
-        <w:br/>
-        <w:t>Penta1 under-1: 60 | Penta3 under-1: 90</w:t>
-        <w:br/>
-        <w:t>Penta3 exceeds Penta1 by 50%.</w:t>
-        <w:br/>
-        <w:t>Reply with option number:</w:t>
-        <w:br/>
-        <w:t>1. Keep as-is</w:t>
-        <w:br/>
-        <w:t>2. Use DTP1 value for both</w:t>
-        <w:br/>
-        <w:t>3. Use DTP3 value for both</w:t>
-        <w:br/>
-        <w:t>4. Replace with specific value</w:t>
-        <w:br/>
-        <w:t>5. Other</w:t>
-      </w:r>
-    </w:p>
-    <w:p>
-      <w:pPr>
         <w:pStyle w:val="ListBullet"/>
         <w:ind w:left="360"/>
       </w:pPr>
       <w:r>
-        <w:t>Narrate: "The 3rd dose cannot exceed the 1st dose — dropout only goes one direction. The agent surfaces the gap (50%) and gives Almaz the same options she'd see in the AHEAD reference guide."</w:t>
+        <w:t>At http://localhost:5001/issues a new row appears: Type=DTP, Facility=Addi Arekay HC, Value=90, Status=NOTIFIED</w:t>
       </w:r>
     </w:p>
     <w:p/>
@@ -6806,34 +6774,7 @@
         <w:rPr>
           <w:sz w:val="21"/>
         </w:rPr>
-        <w:t>Step 4 — Select option 2 (use DTP1 value for both) to demonstrate the confirmation step</w:t>
-      </w:r>
-    </w:p>
-    <w:p>
-      <w:pPr>
-        <w:pStyle w:val="ListBullet"/>
-        <w:ind w:left="360"/>
-      </w:pPr>
-      <w:r>
-        <w:t>Narrate: "Almaz knows that Penta1 (60) is the correct reference. She selects option 2."</w:t>
-      </w:r>
-    </w:p>
-    <w:p>
-      <w:pPr>
-        <w:pStyle w:val="ListBullet"/>
-        <w:ind w:left="360"/>
-      </w:pPr>
-      <w:r>
-        <w:t>Reply: 2</w:t>
-      </w:r>
-    </w:p>
-    <w:p>
-      <w:pPr>
-        <w:pStyle w:val="ListBullet"/>
-        <w:ind w:left="360"/>
-      </w:pPr>
-      <w:r>
-        <w:t>Agent sends the YES/NO confirmation (issue log: CONFIRMING):</w:t>
+        <w:t>Step 4 — WhatsApp alert arrives</w:t>
       </w:r>
     </w:p>
     <w:p>
@@ -6847,13 +6788,24 @@
           <w:color w:val="333333"/>
           <w:sz w:val="17"/>
         </w:rPr>
-        <w:t>[DQ-XXXX] Confirm change:</w:t>
+        <w:t>AHEAD DQ Alert [DQ-YYYY]</w:t>
         <w:br/>
-        <w:t>Penta3 &lt;1yr — Addi Arekay Health Center (Jun 2026)</w:t>
+        <w:t>Addi Arekay Health Center — Jun 2026</w:t>
         <w:br/>
-        <w:t>90 -&gt; 60 (set to DTP1 value)</w:t>
+        <w:t>DTP1=60, DTP3=90 (DTP3 &gt; DTP1, gap: 50%)</w:t>
         <w:br/>
-        <w:t>Reply YES to update DHIS2 or NO to choose again.</w:t>
+        <w:br/>
+        <w:t>Reply with option number:</w:t>
+        <w:br/>
+        <w:t>1. Keep as-is (no action)</w:t>
+        <w:br/>
+        <w:t>2. Use DTP1 value for both</w:t>
+        <w:br/>
+        <w:t>3. Use DTP3 value for both</w:t>
+        <w:br/>
+        <w:t>4. Replace with specific value</w:t>
+        <w:br/>
+        <w:t>5. Other reason</w:t>
       </w:r>
     </w:p>
     <w:p>
@@ -6862,30 +6814,7 @@
         <w:ind w:left="360"/>
       </w:pPr>
       <w:r>
-        <w:t>Reply: YES</w:t>
-      </w:r>
-    </w:p>
-    <w:p>
-      <w:pPr>
-        <w:pStyle w:val="ListBullet"/>
-        <w:ind w:left="360"/>
-      </w:pPr>
-      <w:r>
-        <w:t>Agent applies and sends:</w:t>
-      </w:r>
-    </w:p>
-    <w:p>
-      <w:pPr>
-        <w:ind w:left="576"/>
-        <w:shd w:val="clear" w:color="auto" w:fill="F2F2F2"/>
-      </w:pPr>
-      <w:r>
-        <w:rPr>
-          <w:rFonts w:ascii="Courier New" w:hAnsi="Courier New"/>
-          <w:color w:val="333333"/>
-          <w:sz w:val="17"/>
-        </w:rPr>
-        <w:t>[DQ-XXXX] Noted. Value corrected to 60 in DHIS2. Thank you.</w:t>
+        <w:t>Narrate: "The options match the AHEAD Excel dropdown exactly — same schema, just delivered by WhatsApp instead of email."</w:t>
       </w:r>
     </w:p>
     <w:p/>
@@ -6894,7 +6823,7 @@
         <w:rPr>
           <w:sz w:val="21"/>
         </w:rPr>
-        <w:t>Step 5 — Show in DHIS2 and issue log</w:t>
+        <w:t>Step 5 — Select option 2 (use DTP1 for both)</w:t>
       </w:r>
     </w:p>
     <w:p>
@@ -6903,7 +6832,7 @@
         <w:ind w:left="360"/>
       </w:pPr>
       <w:r>
-        <w:t>Refresh Addi Arekay HC / June 2026: Penta3 under-1 = 60 (corrected to match Penta1)</w:t>
+        <w:t>Narrate: "Almaz knows Penta1 = 60 is correct. She selects option 2 — agent will set DTP3 to match DTP1."</w:t>
       </w:r>
     </w:p>
     <w:p>
@@ -6912,7 +6841,103 @@
         <w:ind w:left="360"/>
       </w:pPr>
       <w:r>
-        <w:t>Issue log: DQ-XXXX | DTP3 &gt; DTP1 | Addi Arekay HC | RESOLVED | Option 2: use DTP1 value (60)</w:t>
+        <w:t>Reply: 2</w:t>
+      </w:r>
+    </w:p>
+    <w:p>
+      <w:pPr>
+        <w:pStyle w:val="ListBullet"/>
+        <w:ind w:left="360"/>
+      </w:pPr>
+      <w:r>
+        <w:t>Issue log updates to CONFIRMING. Agent sends:</w:t>
+      </w:r>
+    </w:p>
+    <w:p>
+      <w:pPr>
+        <w:ind w:left="576"/>
+        <w:shd w:val="clear" w:color="auto" w:fill="F2F2F2"/>
+      </w:pPr>
+      <w:r>
+        <w:rPr>
+          <w:rFonts w:ascii="Courier New" w:hAnsi="Courier New"/>
+          <w:color w:val="333333"/>
+          <w:sz w:val="17"/>
+        </w:rPr>
+        <w:t>[DQ-YYYY] Confirm: Set DTP3 to match DTP1 (60)</w:t>
+        <w:br/>
+        <w:t>Addi Arekay Health Center (Jun 2026)</w:t>
+        <w:br/>
+        <w:br/>
+        <w:t>Reply YES to update DHIS2 or NO to choose again.</w:t>
+      </w:r>
+    </w:p>
+    <w:p/>
+    <w:p>
+      <w:r>
+        <w:rPr>
+          <w:sz w:val="21"/>
+        </w:rPr>
+        <w:t>Step 6 — Confirm</w:t>
+      </w:r>
+    </w:p>
+    <w:p>
+      <w:pPr>
+        <w:pStyle w:val="ListBullet"/>
+        <w:ind w:left="360"/>
+      </w:pPr>
+      <w:r>
+        <w:t>Reply: YES</w:t>
+      </w:r>
+    </w:p>
+    <w:p>
+      <w:pPr>
+        <w:pStyle w:val="ListBullet"/>
+        <w:ind w:left="360"/>
+      </w:pPr>
+      <w:r>
+        <w:t>Agent writes Penta3 = 60 to DHIS2. Issue log updates to RESOLVED. Confirmation:</w:t>
+      </w:r>
+    </w:p>
+    <w:p>
+      <w:pPr>
+        <w:ind w:left="576"/>
+        <w:shd w:val="clear" w:color="auto" w:fill="F2F2F2"/>
+      </w:pPr>
+      <w:r>
+        <w:rPr>
+          <w:rFonts w:ascii="Courier New" w:hAnsi="Courier New"/>
+          <w:color w:val="333333"/>
+          <w:sz w:val="17"/>
+        </w:rPr>
+        <w:t>[DQ-YYYY] Noted. DTP3 set to match DTP1 (60) in DHIS2. Thank you.</w:t>
+      </w:r>
+    </w:p>
+    <w:p/>
+    <w:p>
+      <w:r>
+        <w:rPr>
+          <w:sz w:val="21"/>
+        </w:rPr>
+        <w:t>Step 7 — Verify in DHIS2</w:t>
+      </w:r>
+    </w:p>
+    <w:p>
+      <w:pPr>
+        <w:pStyle w:val="ListBullet"/>
+        <w:ind w:left="360"/>
+      </w:pPr>
+      <w:r>
+        <w:t>Refresh the Addi Arekay HC / June 2026 form.</w:t>
+      </w:r>
+    </w:p>
+    <w:p>
+      <w:pPr>
+        <w:pStyle w:val="ListBullet"/>
+        <w:ind w:left="360"/>
+      </w:pPr>
+      <w:r>
+        <w:t>DPT-HepB-HIB 3, &lt; 1 year now shows 60 (updated by agent_service, matching DTP1).</w:t>
       </w:r>
     </w:p>
     <w:p/>
@@ -6930,7 +6955,7 @@
         <w:ind w:left="360"/>
       </w:pPr>
       <w:r>
-        <w:t>DHIS2: Addi Arekay HC, Jun 2026, Penta1=60, Penta3=60 — Penta3 corrected to match Penta1</w:t>
+        <w:t>DHIS2: DTP1=60, DTP3=60 — Penta3 corrected to match Penta1</w:t>
       </w:r>
     </w:p>
     <w:p>
@@ -6939,7 +6964,16 @@
         <w:ind w:left="360"/>
       </w:pPr>
       <w:r>
-        <w:t>SMS thread: 4 messages — notification, "2", confirmation request, "YES", resolution</w:t>
+        <w:t>Issue log: RESOLVED — "DTP3 set to match DTP1 (60) in DHIS2."</w:t>
+      </w:r>
+    </w:p>
+    <w:p>
+      <w:pPr>
+        <w:pStyle w:val="ListBullet"/>
+        <w:ind w:left="360"/>
+      </w:pPr>
+      <w:r>
+        <w:t>SMS thread: 3 turns — alert / "2" / confirmation / "YES" / resolution</w:t>
       </w:r>
     </w:p>
     <w:p/>

</xml_diff>

<commit_message>
Update docs to reflect changes since last doc update
AHEAD_AI_Agent_v0.md (Notion reference):
- Demo reset: replace old python3 script with curl /api/reset-demo;
  explain WHY DHIS2 data must be cleared (lastUpdated not updated on same-value save)
- Message examples: full field names ('BCG (under 1 year)' etc.) in alerts and confirmations
- Conversation states section: add resubmission superseding, multi-issue queuing,
  issue log timestamp (EST/EDT) and Resend button notes
- Demo A/B walkthrough: updated to show current exact message format

generate_ux_doc.py / AHEAD_AI_UX_Workflow.docx:
- Demo prerequisites: api/reset-demo command and rationale
- Demo A: BCG (under 1 year) in alert and confirmation
- Demo B: DTP alert now shows each dose on its own labelled line;
  confirmation shows DTP3 (under 1 year) → 60 format

Co-Authored-By: Claude Sonnet 4.6 <noreply@anthropic.com>
</commit_message>
<xml_diff>
--- a/docs/AHEAD_AI_UX_Workflow.docx
+++ b/docs/AHEAD_AI_UX_Workflow.docx
@@ -6191,7 +6191,16 @@
         <w:rPr>
           <w:sz w:val="21"/>
         </w:rPr>
-        <w:t>Addi Arekay Health Center is a Health Center (tier 2). BCG under-1 baseline: ~97/month (range 80–115 across 22 months). Penta1 under-1: ~87. Penta3 under-1: ~71. Outlier detection threshold: Z-score &gt; 2.0 SD OR absolute diff &gt; 100 doses. Detection is within ~30 seconds via lastUpdated polling, or trigger instantly with: POST http://localhost:5001/api/scan</w:t>
+        <w:t>Addi Arekay Health Center is a Health Center (tier 2). BCG under-1 baseline: ~97/month (range 80–115 across 22 months). Penta1 under-1: ~87. Penta3 under-1: ~71. Outlier detection threshold: Z-score &gt; 2.0 SD AND absolute diff &gt; 100 doses. Detection is within ~30 seconds via lastUpdated polling.</w:t>
+      </w:r>
+    </w:p>
+    <w:p/>
+    <w:p>
+      <w:r>
+        <w:rPr>
+          <w:sz w:val="21"/>
+        </w:rPr>
+        <w:t>Between demo runs, reset with: curl -s -X POST http://localhost:5001/api/reset-demo — this clears both the agent DB and the June 2026 DHIS2 data so each run starts from a blank form. No agent restart needed.</w:t>
       </w:r>
     </w:p>
     <w:p/>
@@ -6410,7 +6419,8 @@
         <w:br/>
         <w:t>Addi Arekay Health Center — Jun 2026</w:t>
         <w:br/>
-        <w:t>BCG: 970 doses (expected 79–114)</w:t>
+        <w:t>BCG (under 1 year): 970 doses (expected 79–114)</w:t>
+        <w:br/>
         <w:br/>
         <w:t>Reply with option number:</w:t>
         <w:br/>
@@ -6519,11 +6529,12 @@
         </w:rPr>
         <w:t>[DQ-XXXX] Confirm change:</w:t>
         <w:br/>
-        <w:t>BCG &lt;1yr — Addi Arekay Health Center (Jun 2026)</w:t>
+        <w:t>BCG (under 1 year) — Addi Arekay Health Center (Jun 2026)</w:t>
         <w:br/>
-        <w:t>970 -&gt; 97</w:t>
+        <w:t>970 → 97</w:t>
         <w:br/>
-        <w:t>Reply YES to update DHIS2 or NO to re-enter.</w:t>
+        <w:br/>
+        <w:t>Reply YES to update DHIS2 or NO to choose again.</w:t>
       </w:r>
     </w:p>
     <w:p>
@@ -6555,7 +6566,7 @@
           <w:color w:val="333333"/>
           <w:sz w:val="17"/>
         </w:rPr>
-        <w:t>[DQ-XXXX] Noted. Value corrected to 97 in DHIS2. Thank you.</w:t>
+        <w:t>[DQ-XXXX] Noted. BCG (under 1 year) corrected to 97 in DHIS2. Thank you.</w:t>
       </w:r>
     </w:p>
     <w:p>
@@ -6792,7 +6803,11 @@
         <w:br/>
         <w:t>Addi Arekay Health Center — Jun 2026</w:t>
         <w:br/>
-        <w:t>DTP1=60, DTP3=90 (DTP3 &gt; DTP1, gap: 50%)</w:t>
+        <w:t>DTP1 (under 1 year): 60 doses</w:t>
+        <w:br/>
+        <w:t>DTP3 (under 1 year): 90 doses</w:t>
+        <w:br/>
+        <w:t>(DTP3 &gt; DTP1, gap: 50%)</w:t>
         <w:br/>
         <w:br/>
         <w:t>Reply with option number:</w:t>
@@ -6864,9 +6879,14 @@
           <w:color w:val="333333"/>
           <w:sz w:val="17"/>
         </w:rPr>
-        <w:t>[DQ-YYYY] Confirm: Set DTP3 to match DTP1 (60)</w:t>
+        <w:t>[DQ-YYYY] Confirm change:</w:t>
         <w:br/>
-        <w:t>Addi Arekay Health Center (Jun 2026)</w:t>
+        <w:t>DTP3 (under 1 year) — Addi Arekay Health Center (Jun 2026)</w:t>
+        <w:br/>
+        <w:t>90 → 60 (use DTP1 value for both)</w:t>
+        <w:br/>
+        <w:br/>
+        <w:t>Reply YES to update DHIS2 or NO to choose again.</w:t>
         <w:br/>
         <w:br/>
         <w:t>Reply YES to update DHIS2 or NO to choose again.</w:t>

</xml_diff>